<commit_message>
new pages- CookiesPolicy.jsx, PrivacyPolicy.jsx, TermsOfService.jsx
</commit_message>
<xml_diff>
--- a/KLAIR.docx
+++ b/KLAIR.docx
@@ -241,28 +241,160 @@
     </w:p>
     <w:p>
       <w:r>
+        <w:t xml:space="preserve">  components/ </w:t>
+      </w:r>
+    </w:p>
+    <w:p>
+      <w:r>
+        <w:t xml:space="preserve">     </w:t>
+      </w:r>
+      <w:proofErr w:type="spellStart"/>
+      <w:r>
+        <w:t>Navbar.jsx</w:t>
+      </w:r>
+      <w:proofErr w:type="spellEnd"/>
+      <w:r>
         <w:t xml:space="preserve"> </w:t>
       </w:r>
+    </w:p>
+    <w:p>
+      <w:r>
+        <w:t xml:space="preserve">     </w:t>
+      </w:r>
+      <w:proofErr w:type="spellStart"/>
+      <w:r>
+        <w:t>Hero.jsx</w:t>
+      </w:r>
+      <w:proofErr w:type="spellEnd"/>
       <w:r>
         <w:t xml:space="preserve"> </w:t>
       </w:r>
-      <w:r>
-        <w:t xml:space="preserve">components/ </w:t>
-      </w:r>
-    </w:p>
-    <w:p>
+    </w:p>
+    <w:p>
+      <w:r>
+        <w:t xml:space="preserve">     </w:t>
+      </w:r>
+      <w:proofErr w:type="spellStart"/>
+      <w:r>
+        <w:t>TrustStrip.jsx</w:t>
+      </w:r>
+      <w:proofErr w:type="spellEnd"/>
       <w:r>
         <w:t xml:space="preserve"> </w:t>
       </w:r>
+    </w:p>
+    <w:p>
+      <w:r>
+        <w:lastRenderedPageBreak/>
+        <w:t xml:space="preserve">     </w:t>
+      </w:r>
+      <w:proofErr w:type="spellStart"/>
+      <w:r>
+        <w:t>Services.jsx</w:t>
+      </w:r>
+      <w:proofErr w:type="spellEnd"/>
+      <w:r>
+        <w:t xml:space="preserve"> </w:t>
+      </w:r>
+    </w:p>
+    <w:p>
+      <w:r>
+        <w:t xml:space="preserve">     </w:t>
+      </w:r>
+      <w:proofErr w:type="spellStart"/>
+      <w:r>
+        <w:t>Products.jsx</w:t>
+      </w:r>
+      <w:proofErr w:type="spellEnd"/>
+      <w:r>
+        <w:t xml:space="preserve"> </w:t>
+      </w:r>
+    </w:p>
+    <w:p>
+      <w:r>
+        <w:t xml:space="preserve">     </w:t>
+      </w:r>
+      <w:proofErr w:type="spellStart"/>
+      <w:r>
+        <w:t>WhyKlair.jsx</w:t>
+      </w:r>
+      <w:proofErr w:type="spellEnd"/>
+      <w:r>
+        <w:t xml:space="preserve"> </w:t>
+      </w:r>
+    </w:p>
+    <w:p>
+      <w:r>
+        <w:t xml:space="preserve">     </w:t>
+      </w:r>
+      <w:proofErr w:type="spellStart"/>
+      <w:r>
+        <w:t>Testimonials.jsx</w:t>
+      </w:r>
+      <w:proofErr w:type="spellEnd"/>
+      <w:r>
+        <w:t xml:space="preserve"> </w:t>
+      </w:r>
+    </w:p>
+    <w:p>
+      <w:r>
+        <w:t xml:space="preserve">     </w:t>
+      </w:r>
+      <w:proofErr w:type="spellStart"/>
+      <w:r>
+        <w:t>CTABanner.jsx</w:t>
+      </w:r>
+      <w:proofErr w:type="spellEnd"/>
+      <w:r>
+        <w:t xml:space="preserve"> </w:t>
+      </w:r>
+    </w:p>
+    <w:p>
+      <w:r>
+        <w:t xml:space="preserve">     </w:t>
+      </w:r>
+      <w:proofErr w:type="spellStart"/>
+      <w:r>
+        <w:t>Contact.jsx</w:t>
+      </w:r>
+      <w:proofErr w:type="spellEnd"/>
+      <w:r>
+        <w:t xml:space="preserve"> </w:t>
+      </w:r>
+    </w:p>
+    <w:p>
+      <w:r>
+        <w:t xml:space="preserve">     </w:t>
+      </w:r>
+      <w:proofErr w:type="spellStart"/>
+      <w:r>
+        <w:t>Footer.jsx</w:t>
+      </w:r>
+      <w:proofErr w:type="spellEnd"/>
+      <w:r>
+        <w:t xml:space="preserve"> </w:t>
+      </w:r>
+    </w:p>
+    <w:p>
       <w:r>
         <w:t xml:space="preserve">  </w:t>
       </w:r>
+      <w:proofErr w:type="spellStart"/>
+      <w:r>
+        <w:t>App.jsx</w:t>
+      </w:r>
+      <w:proofErr w:type="spellEnd"/>
+      <w:r>
+        <w:t xml:space="preserve"> </w:t>
+      </w:r>
+    </w:p>
+    <w:p>
       <w:r>
         <w:t xml:space="preserve">  </w:t>
       </w:r>
       <w:proofErr w:type="spellStart"/>
       <w:r>
-        <w:t>Navbar.jsx</w:t>
+        <w:t>main.jsx</w:t>
       </w:r>
       <w:proofErr w:type="spellEnd"/>
       <w:r>
@@ -271,301 +403,385 @@
     </w:p>
     <w:p>
       <w:r>
-        <w:t xml:space="preserve">  </w:t>
-      </w:r>
-      <w:r>
-        <w:t xml:space="preserve">  </w:t>
+        <w:t xml:space="preserve"> index.css</w:t>
+      </w:r>
+    </w:p>
+    <w:p/>
+    <w:p>
+      <w:r>
+        <w:t xml:space="preserve">COLORS USED: </w:t>
+      </w:r>
+      <w:r>
+        <w:br/>
+        <w:t>Burgundy:  #7c1c2e</w:t>
+      </w:r>
+      <w:proofErr w:type="gramStart"/>
+      <w:r>
+        <w:t xml:space="preserve">   (</w:t>
+      </w:r>
+      <w:proofErr w:type="gramEnd"/>
+      <w:r>
+        <w:t>primary)</w:t>
+      </w:r>
+    </w:p>
+    <w:p>
+      <w:r>
+        <w:t>Burgundy light: #9e2a3</w:t>
+      </w:r>
+      <w:proofErr w:type="gramStart"/>
+      <w:r>
+        <w:t>f  (</w:t>
+      </w:r>
+      <w:proofErr w:type="gramEnd"/>
+      <w:r>
+        <w:t>hover states)</w:t>
+      </w:r>
+    </w:p>
+    <w:p>
+      <w:r>
+        <w:t>Burgundy muted: #f5e8</w:t>
+      </w:r>
+      <w:proofErr w:type="gramStart"/>
+      <w:r>
+        <w:t>eb  (</w:t>
+      </w:r>
+      <w:proofErr w:type="gramEnd"/>
+      <w:r>
+        <w:t>backgrounds/tints)</w:t>
+      </w:r>
+    </w:p>
+    <w:p>
+      <w:r>
+        <w:t>Navy:      #1a237e</w:t>
+      </w:r>
+      <w:proofErr w:type="gramStart"/>
+      <w:r>
+        <w:t xml:space="preserve">   (</w:t>
+      </w:r>
+      <w:proofErr w:type="gramEnd"/>
+      <w:r>
+        <w:t>secondary)</w:t>
+      </w:r>
+    </w:p>
+    <w:p>
+      <w:r>
+        <w:t>Navy light: #</w:t>
+      </w:r>
+      <w:proofErr w:type="gramStart"/>
+      <w:r>
+        <w:t>283593  (</w:t>
+      </w:r>
+      <w:proofErr w:type="gramEnd"/>
+      <w:r>
+        <w:t>hover)</w:t>
+      </w:r>
+    </w:p>
+    <w:p>
+      <w:r>
+        <w:t>Navy muted: #e8eaf</w:t>
+      </w:r>
+      <w:proofErr w:type="gramStart"/>
+      <w:r>
+        <w:t>6  (</w:t>
+      </w:r>
+      <w:proofErr w:type="gramEnd"/>
+      <w:r>
+        <w:t>backgrounds/tints)</w:t>
+      </w:r>
+    </w:p>
+    <w:p>
+      <w:r>
+        <w:t>White:     #ffffff</w:t>
+      </w:r>
+    </w:p>
+    <w:p>
+      <w:r>
+        <w:t>Off-white: #f8fafc</w:t>
+      </w:r>
+    </w:p>
+    <w:p>
+      <w:r>
+        <w:t>Dark text: #0f172a</w:t>
+      </w:r>
+    </w:p>
+    <w:p>
+      <w:r>
+        <w:t>Muted text: #64748b</w:t>
+      </w:r>
+    </w:p>
+    <w:p/>
+    <w:p>
+      <w:r>
+        <w:t xml:space="preserve">FOR BLOGS: </w:t>
+      </w:r>
+    </w:p>
+    <w:p>
+      <w:r>
+        <w:rPr>
+          <w:b/>
+          <w:bCs/>
+        </w:rPr>
+        <w:t>What I'll create:</w:t>
+      </w:r>
+    </w:p>
+    <w:p>
+      <w:pPr>
+        <w:numPr>
+          <w:ilvl w:val="0"/>
+          <w:numId w:val="1"/>
+        </w:numPr>
+      </w:pPr>
+      <w:proofErr w:type="spellStart"/>
+      <w:r>
+        <w:rPr>
+          <w:b/>
+          <w:bCs/>
+        </w:rPr>
+        <w:t>Supabase</w:t>
+      </w:r>
+      <w:proofErr w:type="spellEnd"/>
+      <w:r>
+        <w:rPr>
+          <w:b/>
+          <w:bCs/>
+        </w:rPr>
+        <w:t xml:space="preserve"> table</w:t>
+      </w:r>
+      <w:r>
+        <w:t xml:space="preserve"> — SQL to run in your </w:t>
+      </w:r>
+      <w:proofErr w:type="spellStart"/>
+      <w:r>
+        <w:t>Supabase</w:t>
+      </w:r>
+      <w:proofErr w:type="spellEnd"/>
+      <w:r>
+        <w:t xml:space="preserve"> dashboard</w:t>
+      </w:r>
+    </w:p>
+    <w:p>
+      <w:pPr>
+        <w:numPr>
+          <w:ilvl w:val="0"/>
+          <w:numId w:val="1"/>
+        </w:numPr>
+      </w:pPr>
+      <w:proofErr w:type="spellStart"/>
+      <w:r>
+        <w:t>src</w:t>
+      </w:r>
+      <w:proofErr w:type="spellEnd"/>
+      <w:r>
+        <w:t>/pages/</w:t>
+      </w:r>
+      <w:proofErr w:type="spellStart"/>
+      <w:r>
+        <w:t>Blog.jsx</w:t>
+      </w:r>
+      <w:proofErr w:type="spellEnd"/>
+      <w:r>
+        <w:t xml:space="preserve"> — public blog index with post cards</w:t>
+      </w:r>
+    </w:p>
+    <w:p>
+      <w:pPr>
+        <w:numPr>
+          <w:ilvl w:val="0"/>
+          <w:numId w:val="1"/>
+        </w:numPr>
+      </w:pPr>
+      <w:proofErr w:type="spellStart"/>
+      <w:r>
+        <w:t>src</w:t>
+      </w:r>
+      <w:proofErr w:type="spellEnd"/>
+      <w:r>
+        <w:t>/pages/</w:t>
+      </w:r>
+      <w:proofErr w:type="spellStart"/>
+      <w:r>
+        <w:t>BlogPost.jsx</w:t>
+      </w:r>
+      <w:proofErr w:type="spellEnd"/>
+      <w:r>
+        <w:t xml:space="preserve"> — individual post page with full content</w:t>
+      </w:r>
+    </w:p>
+    <w:p>
+      <w:pPr>
+        <w:numPr>
+          <w:ilvl w:val="0"/>
+          <w:numId w:val="1"/>
+        </w:numPr>
+      </w:pPr>
+      <w:proofErr w:type="spellStart"/>
+      <w:r>
+        <w:t>src</w:t>
+      </w:r>
+      <w:proofErr w:type="spellEnd"/>
+      <w:r>
+        <w:t>/pages/</w:t>
+      </w:r>
+      <w:proofErr w:type="spellStart"/>
+      <w:r>
+        <w:t>AdminBlog.jsx</w:t>
+      </w:r>
+      <w:proofErr w:type="spellEnd"/>
+      <w:r>
+        <w:t xml:space="preserve"> — password-protected admin to create/edit/delete posts</w:t>
+      </w:r>
+    </w:p>
+    <w:p>
+      <w:pPr>
+        <w:numPr>
+          <w:ilvl w:val="0"/>
+          <w:numId w:val="1"/>
+        </w:numPr>
+      </w:pPr>
+      <w:proofErr w:type="spellStart"/>
+      <w:r>
+        <w:lastRenderedPageBreak/>
+        <w:t>src</w:t>
+      </w:r>
+      <w:proofErr w:type="spellEnd"/>
+      <w:r>
+        <w:t xml:space="preserve">/lib/supabase.js — shared </w:t>
+      </w:r>
+      <w:proofErr w:type="spellStart"/>
+      <w:r>
+        <w:t>Supabase</w:t>
+      </w:r>
+      <w:proofErr w:type="spellEnd"/>
+      <w:r>
+        <w:t xml:space="preserve"> client (or I'll reuse your existing one)</w:t>
+      </w:r>
+    </w:p>
+    <w:p>
+      <w:r>
+        <w:rPr>
+          <w:b/>
+          <w:bCs/>
+        </w:rPr>
+        <w:t>One thing I need</w:t>
+      </w:r>
+      <w:r>
+        <w:t xml:space="preserve"> — what's </w:t>
+      </w:r>
+      <w:proofErr w:type="gramStart"/>
+      <w:r>
+        <w:t>your</w:t>
+      </w:r>
+      <w:proofErr w:type="gramEnd"/>
+      <w:r>
+        <w:t xml:space="preserve"> existing </w:t>
+      </w:r>
+      <w:proofErr w:type="spellStart"/>
+      <w:r>
+        <w:t>Supabase</w:t>
+      </w:r>
+      <w:proofErr w:type="spellEnd"/>
+      <w:r>
+        <w:t xml:space="preserve"> client setup? Do you already have a supabase.js or supabaseClient.js file somewhere in </w:t>
+      </w:r>
+      <w:proofErr w:type="spellStart"/>
+      <w:r>
+        <w:t>src</w:t>
+      </w:r>
+      <w:proofErr w:type="spellEnd"/>
+      <w:r>
+        <w:t>/? If so, paste the import path and I'll reuse it rather than create a duplicate.</w:t>
+      </w:r>
+    </w:p>
+    <w:p/>
+    <w:p>
+      <w:proofErr w:type="spellStart"/>
+      <w:r>
+        <w:t>src</w:t>
+      </w:r>
+      <w:proofErr w:type="spellEnd"/>
+      <w:r>
+        <w:t>/</w:t>
+      </w:r>
+    </w:p>
+    <w:p>
+      <w:r>
+        <w:t xml:space="preserve">  lib/</w:t>
+      </w:r>
+    </w:p>
+    <w:p>
+      <w:r>
+        <w:t xml:space="preserve">    supabase.js</w:t>
+      </w:r>
+    </w:p>
+    <w:p>
+      <w:r>
+        <w:t xml:space="preserve">  pages/</w:t>
+      </w:r>
+    </w:p>
+    <w:p>
+      <w:r>
+        <w:t xml:space="preserve">    </w:t>
+      </w:r>
+      <w:proofErr w:type="spellStart"/>
+      <w:r>
+        <w:t>Blog.jsx</w:t>
+      </w:r>
+      <w:proofErr w:type="spellEnd"/>
+    </w:p>
+    <w:p>
+      <w:r>
+        <w:t xml:space="preserve">    </w:t>
+      </w:r>
+      <w:proofErr w:type="spellStart"/>
+      <w:r>
+        <w:t>BlogPost.jsx</w:t>
+      </w:r>
+      <w:proofErr w:type="spellEnd"/>
+    </w:p>
+    <w:p>
+      <w:r>
+        <w:t xml:space="preserve">    </w:t>
+      </w:r>
+      <w:proofErr w:type="spellStart"/>
+      <w:r>
+        <w:t>AdminBlog.jsx</w:t>
+      </w:r>
+      <w:proofErr w:type="spellEnd"/>
+    </w:p>
+    <w:p/>
+    <w:p>
+      <w:proofErr w:type="spellStart"/>
+      <w:r>
+        <w:t>Supabase</w:t>
+      </w:r>
+      <w:proofErr w:type="spellEnd"/>
+      <w:r>
+        <w:t xml:space="preserve">: </w:t>
+      </w:r>
+      <w:r>
+        <w:t>(For Blog)</w:t>
       </w:r>
       <w:r>
         <w:t xml:space="preserve"> </w:t>
       </w:r>
       <w:proofErr w:type="spellStart"/>
       <w:r>
-        <w:t>Hero.jsx</w:t>
-      </w:r>
-      <w:proofErr w:type="spellEnd"/>
-      <w:r>
-        <w:t xml:space="preserve"> </w:t>
-      </w:r>
-    </w:p>
-    <w:p>
-      <w:r>
-        <w:t xml:space="preserve">   </w:t>
-      </w:r>
-      <w:r>
-        <w:t xml:space="preserve">  </w:t>
-      </w:r>
-      <w:proofErr w:type="spellStart"/>
-      <w:r>
-        <w:t>TrustStrip.jsx</w:t>
-      </w:r>
-      <w:proofErr w:type="spellEnd"/>
-      <w:r>
-        <w:t xml:space="preserve"> </w:t>
-      </w:r>
-    </w:p>
-    <w:p>
-      <w:r>
-        <w:lastRenderedPageBreak/>
-        <w:t xml:space="preserve">   </w:t>
-      </w:r>
-      <w:r>
-        <w:t xml:space="preserve">  </w:t>
-      </w:r>
-      <w:proofErr w:type="spellStart"/>
-      <w:r>
-        <w:t>Services.jsx</w:t>
-      </w:r>
-      <w:proofErr w:type="spellEnd"/>
-      <w:r>
-        <w:t xml:space="preserve"> </w:t>
-      </w:r>
-    </w:p>
-    <w:p>
-      <w:r>
-        <w:t xml:space="preserve">   </w:t>
-      </w:r>
-      <w:r>
-        <w:t xml:space="preserve">  </w:t>
-      </w:r>
-      <w:proofErr w:type="spellStart"/>
-      <w:r>
-        <w:t>Products.jsx</w:t>
-      </w:r>
-      <w:proofErr w:type="spellEnd"/>
-      <w:r>
-        <w:t xml:space="preserve"> </w:t>
-      </w:r>
-    </w:p>
-    <w:p>
-      <w:r>
-        <w:t xml:space="preserve">  </w:t>
-      </w:r>
-      <w:r>
-        <w:t xml:space="preserve">  </w:t>
-      </w:r>
-      <w:r>
-        <w:t xml:space="preserve"> </w:t>
-      </w:r>
-      <w:proofErr w:type="spellStart"/>
-      <w:r>
-        <w:t>WhyKlair.jsx</w:t>
-      </w:r>
-      <w:proofErr w:type="spellEnd"/>
-      <w:r>
-        <w:t xml:space="preserve"> </w:t>
-      </w:r>
-    </w:p>
-    <w:p>
-      <w:r>
-        <w:t xml:space="preserve">   </w:t>
-      </w:r>
-      <w:r>
-        <w:t xml:space="preserve">  </w:t>
-      </w:r>
-      <w:proofErr w:type="spellStart"/>
-      <w:r>
-        <w:t>Testimonials.jsx</w:t>
-      </w:r>
-      <w:proofErr w:type="spellEnd"/>
-      <w:r>
-        <w:t xml:space="preserve"> </w:t>
-      </w:r>
-    </w:p>
-    <w:p>
-      <w:r>
-        <w:t xml:space="preserve">   </w:t>
-      </w:r>
-      <w:r>
-        <w:t xml:space="preserve">  </w:t>
-      </w:r>
-      <w:proofErr w:type="spellStart"/>
-      <w:r>
-        <w:t>CTABanner.jsx</w:t>
-      </w:r>
-      <w:proofErr w:type="spellEnd"/>
-      <w:r>
-        <w:t xml:space="preserve"> </w:t>
-      </w:r>
-    </w:p>
-    <w:p>
-      <w:r>
-        <w:t xml:space="preserve">   </w:t>
-      </w:r>
-      <w:r>
-        <w:t xml:space="preserve">  </w:t>
-      </w:r>
-      <w:proofErr w:type="spellStart"/>
-      <w:r>
-        <w:t>Contact.jsx</w:t>
-      </w:r>
-      <w:proofErr w:type="spellEnd"/>
-      <w:r>
-        <w:t xml:space="preserve"> </w:t>
-      </w:r>
-    </w:p>
-    <w:p>
-      <w:r>
-        <w:t xml:space="preserve"> </w:t>
-      </w:r>
-      <w:r>
-        <w:t xml:space="preserve">  </w:t>
-      </w:r>
-      <w:r>
-        <w:t xml:space="preserve">  </w:t>
-      </w:r>
-      <w:proofErr w:type="spellStart"/>
-      <w:r>
-        <w:t>Footer.jsx</w:t>
-      </w:r>
-      <w:proofErr w:type="spellEnd"/>
-      <w:r>
-        <w:t xml:space="preserve"> </w:t>
-      </w:r>
-    </w:p>
-    <w:p>
-      <w:r>
-        <w:t xml:space="preserve"> </w:t>
-      </w:r>
-      <w:r>
-        <w:t xml:space="preserve"> </w:t>
-      </w:r>
-      <w:proofErr w:type="spellStart"/>
-      <w:r>
-        <w:t>App.jsx</w:t>
-      </w:r>
-      <w:proofErr w:type="spellEnd"/>
-      <w:r>
-        <w:t xml:space="preserve"> </w:t>
-      </w:r>
-    </w:p>
-    <w:p>
-      <w:r>
-        <w:t xml:space="preserve"> </w:t>
-      </w:r>
-      <w:r>
-        <w:t xml:space="preserve"> </w:t>
-      </w:r>
-      <w:proofErr w:type="spellStart"/>
-      <w:r>
-        <w:t>main.jsx</w:t>
-      </w:r>
-      <w:proofErr w:type="spellEnd"/>
-      <w:r>
-        <w:t xml:space="preserve"> </w:t>
-      </w:r>
-    </w:p>
-    <w:p>
-      <w:r>
-        <w:t xml:space="preserve"> index.css</w:t>
-      </w:r>
-    </w:p>
-    <w:p/>
-    <w:p>
-      <w:r>
-        <w:t xml:space="preserve">COLORS USED: </w:t>
-      </w:r>
-      <w:r>
-        <w:br/>
-      </w:r>
-      <w:r>
-        <w:t>Burgundy:  #7c1c2e</w:t>
-      </w:r>
-      <w:proofErr w:type="gramStart"/>
-      <w:r>
-        <w:t xml:space="preserve">   (</w:t>
-      </w:r>
-      <w:proofErr w:type="gramEnd"/>
-      <w:r>
-        <w:t>primary)</w:t>
-      </w:r>
-    </w:p>
-    <w:p>
-      <w:r>
-        <w:t>Burgundy light: #9e2a3</w:t>
-      </w:r>
-      <w:proofErr w:type="gramStart"/>
-      <w:r>
-        <w:t>f  (</w:t>
-      </w:r>
-      <w:proofErr w:type="gramEnd"/>
-      <w:r>
-        <w:t>hover states)</w:t>
-      </w:r>
-    </w:p>
-    <w:p>
-      <w:r>
-        <w:t>Burgundy muted: #f5e8</w:t>
-      </w:r>
-      <w:proofErr w:type="gramStart"/>
-      <w:r>
-        <w:t>eb  (</w:t>
-      </w:r>
-      <w:proofErr w:type="gramEnd"/>
-      <w:r>
-        <w:t>backgrounds/tints)</w:t>
-      </w:r>
-    </w:p>
-    <w:p>
-      <w:r>
-        <w:t>Navy:      #1a237e</w:t>
-      </w:r>
-      <w:proofErr w:type="gramStart"/>
-      <w:r>
-        <w:t xml:space="preserve">   (</w:t>
-      </w:r>
-      <w:proofErr w:type="gramEnd"/>
-      <w:r>
-        <w:t>secondary)</w:t>
-      </w:r>
-    </w:p>
-    <w:p>
-      <w:r>
-        <w:t>Navy light: #</w:t>
-      </w:r>
-      <w:proofErr w:type="gramStart"/>
-      <w:r>
-        <w:t>283593  (</w:t>
-      </w:r>
-      <w:proofErr w:type="gramEnd"/>
-      <w:r>
-        <w:t>hover)</w:t>
-      </w:r>
-    </w:p>
-    <w:p>
-      <w:r>
-        <w:t>Navy muted: #e8eaf</w:t>
-      </w:r>
-      <w:proofErr w:type="gramStart"/>
-      <w:r>
-        <w:t>6  (</w:t>
-      </w:r>
-      <w:proofErr w:type="gramEnd"/>
-      <w:r>
-        <w:t>backgrounds/tints)</w:t>
-      </w:r>
-    </w:p>
-    <w:p>
-      <w:r>
-        <w:t>White:     #ffffff</w:t>
-      </w:r>
-    </w:p>
-    <w:p>
-      <w:r>
-        <w:t>Off-white: #f8fafc</w:t>
-      </w:r>
-    </w:p>
-    <w:p>
-      <w:r>
-        <w:t>Dark text: #0f172a</w:t>
-      </w:r>
-    </w:p>
-    <w:p>
-      <w:r>
-        <w:t>Muted text: #64748b</w:t>
-      </w:r>
-    </w:p>
-    <w:p/>
+        <w:t>AdminBlog.jsx</w:t>
+      </w:r>
+      <w:proofErr w:type="spellEnd"/>
+    </w:p>
+    <w:p>
+      <w:r>
+        <w:rPr>
+          <w:b/>
+          <w:bCs/>
+        </w:rPr>
+        <w:t>Admin password</w:t>
+      </w:r>
+      <w:r>
+        <w:t xml:space="preserve"> is klair2024!</w:t>
+      </w:r>
+    </w:p>
     <w:p/>
     <w:sectPr>
       <w:pgSz w:w="12240" w:h="15840"/>
@@ -575,6 +791,127 @@
     </w:sectPr>
   </w:body>
 </w:document>
+</file>
+
+<file path=word/numbering.xml><?xml version="1.0" encoding="utf-8"?>
+<w:numbering xmlns:wpc="http://schemas.microsoft.com/office/word/2010/wordprocessingCanvas" xmlns:cx="http://schemas.microsoft.com/office/drawing/2014/chartex" xmlns:cx1="http://schemas.microsoft.com/office/drawing/2015/9/8/chartex" xmlns:cx2="http://schemas.microsoft.com/office/drawing/2015/10/21/chartex" xmlns:cx3="http://schemas.microsoft.com/office/drawing/2016/5/9/chartex" xmlns:cx4="http://schemas.microsoft.com/office/drawing/2016/5/10/chartex" xmlns:cx5="http://schemas.microsoft.com/office/drawing/2016/5/11/chartex" xmlns:cx6="http://schemas.microsoft.com/office/drawing/2016/5/12/chartex" xmlns:cx7="http://schemas.microsoft.com/office/drawing/2016/5/13/chartex" xmlns:cx8="http://schemas.microsoft.com/office/drawing/2016/5/14/chartex" xmlns:mc="http://schemas.openxmlformats.org/markup-compatibility/2006" xmlns:aink="http://schemas.microsoft.com/office/drawing/2016/ink" xmlns:am3d="http://schemas.microsoft.com/office/drawing/2017/model3d" xmlns:o="urn:schemas-microsoft-com:office:office" xmlns:oel="http://schemas.microsoft.com/office/2019/extlst" xmlns:r="http://schemas.openxmlformats.org/officeDocument/2006/relationships" xmlns:m="http://schemas.openxmlformats.org/officeDocument/2006/math" xmlns:v="urn:schemas-microsoft-com:vml" xmlns:wp14="http://schemas.microsoft.com/office/word/2010/wordprocessingDrawing" xmlns:wp="http://schemas.openxmlformats.org/drawingml/2006/wordprocessingDrawing" xmlns:w10="urn:schemas-microsoft-com:office:word" xmlns:w="http://schemas.openxmlformats.org/wordprocessingml/2006/main" xmlns:w14="http://schemas.microsoft.com/office/word/2010/wordml" xmlns:w15="http://schemas.microsoft.com/office/word/2012/wordml" xmlns:w16cex="http://schemas.microsoft.com/office/word/2018/wordml/cex" xmlns:w16cid="http://schemas.microsoft.com/office/word/2016/wordml/cid" xmlns:w16="http://schemas.microsoft.com/office/word/2018/wordml" xmlns:w16du="http://schemas.microsoft.com/office/word/2023/wordml/word16du" xmlns:w16sdtdh="http://schemas.microsoft.com/office/word/2020/wordml/sdtdatahash" xmlns:w16sdtfl="http://schemas.microsoft.com/office/word/2024/wordml/sdtformatlock" xmlns:w16se="http://schemas.microsoft.com/office/word/2015/wordml/symex" xmlns:wpg="http://schemas.microsoft.com/office/word/2010/wordprocessingGroup" xmlns:wpi="http://schemas.microsoft.com/office/word/2010/wordprocessingInk" xmlns:wne="http://schemas.microsoft.com/office/word/2006/wordml" xmlns:wps="http://schemas.microsoft.com/office/word/2010/wordprocessingShape" mc:Ignorable="w14 w15 w16se w16cid w16 w16cex w16sdtdh w16sdtfl w16du wp14">
+  <w:abstractNum w:abstractNumId="0" w15:restartNumberingAfterBreak="0">
+    <w:nsid w:val="319142FD"/>
+    <w:multiLevelType w:val="multilevel"/>
+    <w:tmpl w:val="5A10A7A6"/>
+    <w:lvl w:ilvl="0">
+      <w:start w:val="1"/>
+      <w:numFmt w:val="decimal"/>
+      <w:lvlText w:val="%1."/>
+      <w:lvlJc w:val="left"/>
+      <w:pPr>
+        <w:tabs>
+          <w:tab w:val="num" w:pos="720"/>
+        </w:tabs>
+        <w:ind w:left="720" w:hanging="360"/>
+      </w:pPr>
+    </w:lvl>
+    <w:lvl w:ilvl="1" w:tentative="1">
+      <w:start w:val="1"/>
+      <w:numFmt w:val="decimal"/>
+      <w:lvlText w:val="%2."/>
+      <w:lvlJc w:val="left"/>
+      <w:pPr>
+        <w:tabs>
+          <w:tab w:val="num" w:pos="1440"/>
+        </w:tabs>
+        <w:ind w:left="1440" w:hanging="360"/>
+      </w:pPr>
+    </w:lvl>
+    <w:lvl w:ilvl="2" w:tentative="1">
+      <w:start w:val="1"/>
+      <w:numFmt w:val="decimal"/>
+      <w:lvlText w:val="%3."/>
+      <w:lvlJc w:val="left"/>
+      <w:pPr>
+        <w:tabs>
+          <w:tab w:val="num" w:pos="2160"/>
+        </w:tabs>
+        <w:ind w:left="2160" w:hanging="360"/>
+      </w:pPr>
+    </w:lvl>
+    <w:lvl w:ilvl="3" w:tentative="1">
+      <w:start w:val="1"/>
+      <w:numFmt w:val="decimal"/>
+      <w:lvlText w:val="%4."/>
+      <w:lvlJc w:val="left"/>
+      <w:pPr>
+        <w:tabs>
+          <w:tab w:val="num" w:pos="2880"/>
+        </w:tabs>
+        <w:ind w:left="2880" w:hanging="360"/>
+      </w:pPr>
+    </w:lvl>
+    <w:lvl w:ilvl="4" w:tentative="1">
+      <w:start w:val="1"/>
+      <w:numFmt w:val="decimal"/>
+      <w:lvlText w:val="%5."/>
+      <w:lvlJc w:val="left"/>
+      <w:pPr>
+        <w:tabs>
+          <w:tab w:val="num" w:pos="3600"/>
+        </w:tabs>
+        <w:ind w:left="3600" w:hanging="360"/>
+      </w:pPr>
+    </w:lvl>
+    <w:lvl w:ilvl="5" w:tentative="1">
+      <w:start w:val="1"/>
+      <w:numFmt w:val="decimal"/>
+      <w:lvlText w:val="%6."/>
+      <w:lvlJc w:val="left"/>
+      <w:pPr>
+        <w:tabs>
+          <w:tab w:val="num" w:pos="4320"/>
+        </w:tabs>
+        <w:ind w:left="4320" w:hanging="360"/>
+      </w:pPr>
+    </w:lvl>
+    <w:lvl w:ilvl="6" w:tentative="1">
+      <w:start w:val="1"/>
+      <w:numFmt w:val="decimal"/>
+      <w:lvlText w:val="%7."/>
+      <w:lvlJc w:val="left"/>
+      <w:pPr>
+        <w:tabs>
+          <w:tab w:val="num" w:pos="5040"/>
+        </w:tabs>
+        <w:ind w:left="5040" w:hanging="360"/>
+      </w:pPr>
+    </w:lvl>
+    <w:lvl w:ilvl="7" w:tentative="1">
+      <w:start w:val="1"/>
+      <w:numFmt w:val="decimal"/>
+      <w:lvlText w:val="%8."/>
+      <w:lvlJc w:val="left"/>
+      <w:pPr>
+        <w:tabs>
+          <w:tab w:val="num" w:pos="5760"/>
+        </w:tabs>
+        <w:ind w:left="5760" w:hanging="360"/>
+      </w:pPr>
+    </w:lvl>
+    <w:lvl w:ilvl="8" w:tentative="1">
+      <w:start w:val="1"/>
+      <w:numFmt w:val="decimal"/>
+      <w:lvlText w:val="%9."/>
+      <w:lvlJc w:val="left"/>
+      <w:pPr>
+        <w:tabs>
+          <w:tab w:val="num" w:pos="6480"/>
+        </w:tabs>
+        <w:ind w:left="6480" w:hanging="360"/>
+      </w:pPr>
+    </w:lvl>
+  </w:abstractNum>
+  <w:num w:numId="1" w16cid:durableId="89816601">
+    <w:abstractNumId w:val="0"/>
+  </w:num>
+</w:numbering>
 </file>
 
 <file path=word/styles.xml><?xml version="1.0" encoding="utf-8"?>

</xml_diff>